<commit_message>
A few more submission related tweaks,
including minor PR code clean up
</commit_message>
<xml_diff>
--- a/paper/imageTasks_paperbody_20240625.docx
+++ b/paper/imageTasks_paperbody_20240625.docx
@@ -7759,21 +7759,7 @@
             <w:rStyle w:val="Hyperlink0"/>
             <w:lang w:val="en-GB"/>
           </w:rPr>
-          <w:t>https://doi.org/10.1177/216</w:t>
-        </w:r>
-        <w:r>
-          <w:rPr>
-            <w:rStyle w:val="Hyperlink0"/>
-            <w:lang w:val="en-GB"/>
-          </w:rPr>
-          <w:t>7</w:t>
-        </w:r>
-        <w:r>
-          <w:rPr>
-            <w:rStyle w:val="Hyperlink0"/>
-            <w:lang w:val="en-GB"/>
-          </w:rPr>
-          <w:t>702621991805</w:t>
+          <w:t>https://doi.org/10.1177/2167702621991805</w:t>
         </w:r>
       </w:hyperlink>
     </w:p>
@@ -8821,9 +8807,12 @@
     <w:sectPr>
       <w:headerReference w:type="default" r:id="rId39"/>
       <w:footerReference w:type="default" r:id="rId40"/>
+      <w:type w:val="continuous"/>
       <w:pgSz w:w="11900" w:h="16840"/>
-      <w:pgMar w:top="1440" w:right="1440" w:bottom="1440" w:left="1440" w:header="708" w:footer="708" w:gutter="0"/>
+      <w:pgMar w:top="1440" w:right="1440" w:bottom="1440" w:left="1440" w:header="709" w:footer="709" w:gutter="0"/>
+      <w:lnNumType w:countBy="1" w:restart="continuous"/>
       <w:cols w:space="720"/>
+      <w:docGrid w:linePitch="326"/>
     </w:sectPr>
   </w:body>
 </w:document>
@@ -9542,6 +9531,14 @@
       <w:szCs w:val="24"/>
       <w:lang w:val="en-US" w:eastAsia="en-US"/>
     </w:rPr>
+  </w:style>
+  <w:style w:type="character" w:styleId="LineNumber">
+    <w:name w:val="line number"/>
+    <w:basedOn w:val="DefaultParagraphFont"/>
+    <w:uiPriority w:val="99"/>
+    <w:semiHidden/>
+    <w:unhideWhenUsed/>
+    <w:rsid w:val="00D16C47"/>
   </w:style>
 </w:styles>
 </file>

</xml_diff>